<commit_message>
Update Final Report with GitHub repository link
</commit_message>
<xml_diff>
--- a/Final_Report_Naitik.docx
+++ b/Final_Report_Naitik.docx
@@ -355,10 +355,7 @@
       </w:r>
       <w:proofErr w:type="spellEnd"/>
       <w:r>
-        <w:t xml:space="preserve"> is an online platform for renting homes for short and long-term durations. The platform serves two types of users: Renters who search and book properties, and Owners </w:t>
-      </w:r>
-      <w:r>
-        <w:t>who manage their listings. The goal is to provide a seamless, secure, and modern rental experience similar to industry leaders like Airbnb.</w:t>
+        <w:t xml:space="preserve"> is an online platform for renting homes for short and long-term durations. The platform serves two types of users: Renters who search and book properties, and Owners who manage their listings. The goal is to provide a seamless, secure, and modern rental experience similar to industry leaders like Airbnb.</w:t>
       </w:r>
     </w:p>
     <w:p>
@@ -423,10 +420,7 @@
         <w:spacing w:before="60" w:after="60"/>
       </w:pPr>
       <w:r>
-        <w:t>A</w:t>
-      </w:r>
-      <w:r>
-        <w:t>llow renters to search, filter, view, and reserve properties</w:t>
+        <w:t>Allow renters to search, filter, view, and reserve properties</w:t>
       </w:r>
     </w:p>
     <w:p>
@@ -478,10 +472,7 @@
         <w:spacing w:before="60" w:after="60"/>
       </w:pPr>
       <w:r>
-        <w:t>Deploy the project o</w:t>
-      </w:r>
-      <w:r>
-        <w:t>n GitHub as a public repository</w:t>
+        <w:t>Deploy the project on GitHub as a public repository</w:t>
       </w:r>
     </w:p>
     <w:p>
@@ -545,10 +536,7 @@
         <w:spacing w:before="60" w:after="60"/>
       </w:pPr>
       <w:r>
-        <w:t>As a renter, I can search and filter properties by location, t</w:t>
-      </w:r>
-      <w:r>
-        <w:t>ype, and price range</w:t>
+        <w:t>As a renter, I can search and filter properties by location, type, and price range</w:t>
       </w:r>
     </w:p>
     <w:p>
@@ -643,10 +631,7 @@
         <w:spacing w:before="60" w:after="60"/>
       </w:pPr>
       <w:r>
-        <w:t>As an owner, I can register, login, and logo</w:t>
-      </w:r>
-      <w:r>
-        <w:t>ut of the application</w:t>
+        <w:t>As an owner, I can register, login, and logout of the application</w:t>
       </w:r>
     </w:p>
     <w:p>
@@ -698,10 +683,7 @@
         <w:spacing w:before="60" w:after="60"/>
       </w:pPr>
       <w:r>
-        <w:t>As an owner, I can message renters who have ma</w:t>
-      </w:r>
-      <w:r>
-        <w:t>de reservations</w:t>
+        <w:t>As an owner, I can message renters who have made reservations</w:t>
       </w:r>
     </w:p>
     <w:p>
@@ -806,12 +788,6 @@
         <w:gridCol w:w="3360"/>
       </w:tblGrid>
       <w:tr>
-        <w:tblPrEx>
-          <w:tblCellMar>
-            <w:top w:w="0" w:type="dxa"/>
-            <w:bottom w:w="0" w:type="dxa"/>
-          </w:tblCellMar>
-        </w:tblPrEx>
         <w:tc>
           <w:tcPr>
             <w:tcW w:w="2500" w:type="dxa"/>
@@ -916,12 +892,6 @@
         </w:tc>
       </w:tr>
       <w:tr>
-        <w:tblPrEx>
-          <w:tblCellMar>
-            <w:top w:w="0" w:type="dxa"/>
-            <w:bottom w:w="0" w:type="dxa"/>
-          </w:tblCellMar>
-        </w:tblPrEx>
         <w:tc>
           <w:tcPr>
             <w:tcW w:w="2500" w:type="dxa"/>
@@ -1021,12 +991,6 @@
         </w:tc>
       </w:tr>
       <w:tr>
-        <w:tblPrEx>
-          <w:tblCellMar>
-            <w:top w:w="0" w:type="dxa"/>
-            <w:bottom w:w="0" w:type="dxa"/>
-          </w:tblCellMar>
-        </w:tblPrEx>
         <w:tc>
           <w:tcPr>
             <w:tcW w:w="2500" w:type="dxa"/>
@@ -1110,12 +1074,6 @@
         </w:tc>
       </w:tr>
       <w:tr>
-        <w:tblPrEx>
-          <w:tblCellMar>
-            <w:top w:w="0" w:type="dxa"/>
-            <w:bottom w:w="0" w:type="dxa"/>
-          </w:tblCellMar>
-        </w:tblPrEx>
         <w:tc>
           <w:tcPr>
             <w:tcW w:w="2500" w:type="dxa"/>
@@ -1199,12 +1157,6 @@
         </w:tc>
       </w:tr>
       <w:tr>
-        <w:tblPrEx>
-          <w:tblCellMar>
-            <w:top w:w="0" w:type="dxa"/>
-            <w:bottom w:w="0" w:type="dxa"/>
-          </w:tblCellMar>
-        </w:tblPrEx>
         <w:tc>
           <w:tcPr>
             <w:tcW w:w="2500" w:type="dxa"/>
@@ -1288,12 +1240,6 @@
         </w:tc>
       </w:tr>
       <w:tr>
-        <w:tblPrEx>
-          <w:tblCellMar>
-            <w:top w:w="0" w:type="dxa"/>
-            <w:bottom w:w="0" w:type="dxa"/>
-          </w:tblCellMar>
-        </w:tblPrEx>
         <w:tc>
           <w:tcPr>
             <w:tcW w:w="2500" w:type="dxa"/>
@@ -1386,12 +1332,6 @@
         </w:tc>
       </w:tr>
       <w:tr>
-        <w:tblPrEx>
-          <w:tblCellMar>
-            <w:top w:w="0" w:type="dxa"/>
-            <w:bottom w:w="0" w:type="dxa"/>
-          </w:tblCellMar>
-        </w:tblPrEx>
         <w:tc>
           <w:tcPr>
             <w:tcW w:w="2500" w:type="dxa"/>
@@ -1491,12 +1431,6 @@
         </w:tc>
       </w:tr>
       <w:tr>
-        <w:tblPrEx>
-          <w:tblCellMar>
-            <w:top w:w="0" w:type="dxa"/>
-            <w:bottom w:w="0" w:type="dxa"/>
-          </w:tblCellMar>
-        </w:tblPrEx>
         <w:tc>
           <w:tcPr>
             <w:tcW w:w="2500" w:type="dxa"/>
@@ -1580,12 +1514,6 @@
         </w:tc>
       </w:tr>
       <w:tr>
-        <w:tblPrEx>
-          <w:tblCellMar>
-            <w:top w:w="0" w:type="dxa"/>
-            <w:bottom w:w="0" w:type="dxa"/>
-          </w:tblCellMar>
-        </w:tblPrEx>
         <w:tc>
           <w:tcPr>
             <w:tcW w:w="2500" w:type="dxa"/>
@@ -1669,12 +1597,6 @@
         </w:tc>
       </w:tr>
       <w:tr>
-        <w:tblPrEx>
-          <w:tblCellMar>
-            <w:top w:w="0" w:type="dxa"/>
-            <w:bottom w:w="0" w:type="dxa"/>
-          </w:tblCellMar>
-        </w:tblPrEx>
         <w:tc>
           <w:tcPr>
             <w:tcW w:w="2500" w:type="dxa"/>
@@ -1806,12 +1728,6 @@
         <w:gridCol w:w="6560"/>
       </w:tblGrid>
       <w:tr>
-        <w:tblPrEx>
-          <w:tblCellMar>
-            <w:top w:w="0" w:type="dxa"/>
-            <w:bottom w:w="0" w:type="dxa"/>
-          </w:tblCellMar>
-        </w:tblPrEx>
         <w:tc>
           <w:tcPr>
             <w:tcW w:w="2800" w:type="dxa"/>
@@ -1882,12 +1798,6 @@
         </w:tc>
       </w:tr>
       <w:tr>
-        <w:tblPrEx>
-          <w:tblCellMar>
-            <w:top w:w="0" w:type="dxa"/>
-            <w:bottom w:w="0" w:type="dxa"/>
-          </w:tblCellMar>
-        </w:tblPrEx>
         <w:tc>
           <w:tcPr>
             <w:tcW w:w="2800" w:type="dxa"/>
@@ -1976,12 +1886,6 @@
         </w:tc>
       </w:tr>
       <w:tr>
-        <w:tblPrEx>
-          <w:tblCellMar>
-            <w:top w:w="0" w:type="dxa"/>
-            <w:bottom w:w="0" w:type="dxa"/>
-          </w:tblCellMar>
-        </w:tblPrEx>
         <w:tc>
           <w:tcPr>
             <w:tcW w:w="2800" w:type="dxa"/>
@@ -2038,12 +1942,6 @@
         </w:tc>
       </w:tr>
       <w:tr>
-        <w:tblPrEx>
-          <w:tblCellMar>
-            <w:top w:w="0" w:type="dxa"/>
-            <w:bottom w:w="0" w:type="dxa"/>
-          </w:tblCellMar>
-        </w:tblPrEx>
         <w:tc>
           <w:tcPr>
             <w:tcW w:w="2800" w:type="dxa"/>
@@ -2199,10 +2097,7 @@
         <w:spacing w:before="80" w:after="80"/>
       </w:pPr>
       <w:r>
-        <w:t>5</w:t>
-      </w:r>
-      <w:r>
-        <w:t xml:space="preserve">. Angular stores these values in </w:t>
+        <w:t xml:space="preserve">5. Angular stores these values in </w:t>
       </w:r>
       <w:proofErr w:type="spellStart"/>
       <w:r>
@@ -2258,10 +2153,7 @@
       </w:r>
       <w:proofErr w:type="spellEnd"/>
       <w:r>
-        <w:t xml:space="preserve"> is cleared to enforce fresh login on ev</w:t>
-      </w:r>
-      <w:r>
-        <w:t>ery session.</w:t>
+        <w:t xml:space="preserve"> is cleared to enforce fresh login on every session.</w:t>
       </w:r>
     </w:p>
     <w:p>
@@ -2323,12 +2215,6 @@
         <w:gridCol w:w="3560"/>
       </w:tblGrid>
       <w:tr>
-        <w:tblPrEx>
-          <w:tblCellMar>
-            <w:top w:w="0" w:type="dxa"/>
-            <w:bottom w:w="0" w:type="dxa"/>
-          </w:tblCellMar>
-        </w:tblPrEx>
         <w:tc>
           <w:tcPr>
             <w:tcW w:w="2000" w:type="dxa"/>
@@ -2467,12 +2353,6 @@
         </w:tc>
       </w:tr>
       <w:tr>
-        <w:tblPrEx>
-          <w:tblCellMar>
-            <w:top w:w="0" w:type="dxa"/>
-            <w:bottom w:w="0" w:type="dxa"/>
-          </w:tblCellMar>
-        </w:tblPrEx>
         <w:tc>
           <w:tcPr>
             <w:tcW w:w="2000" w:type="dxa"/>
@@ -2583,12 +2463,6 @@
         </w:tc>
       </w:tr>
       <w:tr>
-        <w:tblPrEx>
-          <w:tblCellMar>
-            <w:top w:w="0" w:type="dxa"/>
-            <w:bottom w:w="0" w:type="dxa"/>
-          </w:tblCellMar>
-        </w:tblPrEx>
         <w:tc>
           <w:tcPr>
             <w:tcW w:w="2000" w:type="dxa"/>
@@ -2699,12 +2573,6 @@
         </w:tc>
       </w:tr>
       <w:tr>
-        <w:tblPrEx>
-          <w:tblCellMar>
-            <w:top w:w="0" w:type="dxa"/>
-            <w:bottom w:w="0" w:type="dxa"/>
-          </w:tblCellMar>
-        </w:tblPrEx>
         <w:tc>
           <w:tcPr>
             <w:tcW w:w="2000" w:type="dxa"/>
@@ -2815,12 +2683,6 @@
         </w:tc>
       </w:tr>
       <w:tr>
-        <w:tblPrEx>
-          <w:tblCellMar>
-            <w:top w:w="0" w:type="dxa"/>
-            <w:bottom w:w="0" w:type="dxa"/>
-          </w:tblCellMar>
-        </w:tblPrEx>
         <w:tc>
           <w:tcPr>
             <w:tcW w:w="2000" w:type="dxa"/>
@@ -2931,12 +2793,6 @@
         </w:tc>
       </w:tr>
       <w:tr>
-        <w:tblPrEx>
-          <w:tblCellMar>
-            <w:top w:w="0" w:type="dxa"/>
-            <w:bottom w:w="0" w:type="dxa"/>
-          </w:tblCellMar>
-        </w:tblPrEx>
         <w:tc>
           <w:tcPr>
             <w:tcW w:w="2000" w:type="dxa"/>
@@ -3047,12 +2903,6 @@
         </w:tc>
       </w:tr>
       <w:tr>
-        <w:tblPrEx>
-          <w:tblCellMar>
-            <w:top w:w="0" w:type="dxa"/>
-            <w:bottom w:w="0" w:type="dxa"/>
-          </w:tblCellMar>
-        </w:tblPrEx>
         <w:tc>
           <w:tcPr>
             <w:tcW w:w="2000" w:type="dxa"/>
@@ -3163,12 +3013,6 @@
         </w:tc>
       </w:tr>
       <w:tr>
-        <w:tblPrEx>
-          <w:tblCellMar>
-            <w:top w:w="0" w:type="dxa"/>
-            <w:bottom w:w="0" w:type="dxa"/>
-          </w:tblCellMar>
-        </w:tblPrEx>
         <w:tc>
           <w:tcPr>
             <w:tcW w:w="2000" w:type="dxa"/>
@@ -3279,12 +3123,6 @@
         </w:tc>
       </w:tr>
       <w:tr>
-        <w:tblPrEx>
-          <w:tblCellMar>
-            <w:top w:w="0" w:type="dxa"/>
-            <w:bottom w:w="0" w:type="dxa"/>
-          </w:tblCellMar>
-        </w:tblPrEx>
         <w:tc>
           <w:tcPr>
             <w:tcW w:w="2000" w:type="dxa"/>
@@ -3395,12 +3233,6 @@
         </w:tc>
       </w:tr>
       <w:tr>
-        <w:tblPrEx>
-          <w:tblCellMar>
-            <w:top w:w="0" w:type="dxa"/>
-            <w:bottom w:w="0" w:type="dxa"/>
-          </w:tblCellMar>
-        </w:tblPrEx>
         <w:tc>
           <w:tcPr>
             <w:tcW w:w="2000" w:type="dxa"/>
@@ -3511,12 +3343,6 @@
         </w:tc>
       </w:tr>
       <w:tr>
-        <w:tblPrEx>
-          <w:tblCellMar>
-            <w:top w:w="0" w:type="dxa"/>
-            <w:bottom w:w="0" w:type="dxa"/>
-          </w:tblCellMar>
-        </w:tblPrEx>
         <w:tc>
           <w:tcPr>
             <w:tcW w:w="2000" w:type="dxa"/>
@@ -3627,12 +3453,6 @@
         </w:tc>
       </w:tr>
       <w:tr>
-        <w:tblPrEx>
-          <w:tblCellMar>
-            <w:top w:w="0" w:type="dxa"/>
-            <w:bottom w:w="0" w:type="dxa"/>
-          </w:tblCellMar>
-        </w:tblPrEx>
         <w:tc>
           <w:tcPr>
             <w:tcW w:w="2000" w:type="dxa"/>
@@ -3743,12 +3563,6 @@
         </w:tc>
       </w:tr>
       <w:tr>
-        <w:tblPrEx>
-          <w:tblCellMar>
-            <w:top w:w="0" w:type="dxa"/>
-            <w:bottom w:w="0" w:type="dxa"/>
-          </w:tblCellMar>
-        </w:tblPrEx>
         <w:tc>
           <w:tcPr>
             <w:tcW w:w="2000" w:type="dxa"/>
@@ -3900,12 +3714,6 @@
         <w:gridCol w:w="4860"/>
       </w:tblGrid>
       <w:tr>
-        <w:tblPrEx>
-          <w:tblCellMar>
-            <w:top w:w="0" w:type="dxa"/>
-            <w:bottom w:w="0" w:type="dxa"/>
-          </w:tblCellMar>
-        </w:tblPrEx>
         <w:tc>
           <w:tcPr>
             <w:tcW w:w="2500" w:type="dxa"/>
@@ -4010,12 +3818,6 @@
         </w:tc>
       </w:tr>
       <w:tr>
-        <w:tblPrEx>
-          <w:tblCellMar>
-            <w:top w:w="0" w:type="dxa"/>
-            <w:bottom w:w="0" w:type="dxa"/>
-          </w:tblCellMar>
-        </w:tblPrEx>
         <w:tc>
           <w:tcPr>
             <w:tcW w:w="2500" w:type="dxa"/>
@@ -4135,12 +3937,6 @@
         </w:tc>
       </w:tr>
       <w:tr>
-        <w:tblPrEx>
-          <w:tblCellMar>
-            <w:top w:w="0" w:type="dxa"/>
-            <w:bottom w:w="0" w:type="dxa"/>
-          </w:tblCellMar>
-        </w:tblPrEx>
         <w:tc>
           <w:tcPr>
             <w:tcW w:w="2500" w:type="dxa"/>
@@ -4228,12 +4024,6 @@
         </w:tc>
       </w:tr>
       <w:tr>
-        <w:tblPrEx>
-          <w:tblCellMar>
-            <w:top w:w="0" w:type="dxa"/>
-            <w:bottom w:w="0" w:type="dxa"/>
-          </w:tblCellMar>
-        </w:tblPrEx>
         <w:tc>
           <w:tcPr>
             <w:tcW w:w="2500" w:type="dxa"/>
@@ -4321,12 +4111,6 @@
         </w:tc>
       </w:tr>
       <w:tr>
-        <w:tblPrEx>
-          <w:tblCellMar>
-            <w:top w:w="0" w:type="dxa"/>
-            <w:bottom w:w="0" w:type="dxa"/>
-          </w:tblCellMar>
-        </w:tblPrEx>
         <w:tc>
           <w:tcPr>
             <w:tcW w:w="2500" w:type="dxa"/>
@@ -4415,12 +4199,6 @@
         </w:tc>
       </w:tr>
       <w:tr>
-        <w:tblPrEx>
-          <w:tblCellMar>
-            <w:top w:w="0" w:type="dxa"/>
-            <w:bottom w:w="0" w:type="dxa"/>
-          </w:tblCellMar>
-        </w:tblPrEx>
         <w:tc>
           <w:tcPr>
             <w:tcW w:w="2500" w:type="dxa"/>
@@ -4591,12 +4369,6 @@
         <w:gridCol w:w="3260"/>
       </w:tblGrid>
       <w:tr>
-        <w:tblPrEx>
-          <w:tblCellMar>
-            <w:top w:w="0" w:type="dxa"/>
-            <w:bottom w:w="0" w:type="dxa"/>
-          </w:tblCellMar>
-        </w:tblPrEx>
         <w:tc>
           <w:tcPr>
             <w:tcW w:w="1800" w:type="dxa"/>
@@ -4735,12 +4507,6 @@
         </w:tc>
       </w:tr>
       <w:tr>
-        <w:tblPrEx>
-          <w:tblCellMar>
-            <w:top w:w="0" w:type="dxa"/>
-            <w:bottom w:w="0" w:type="dxa"/>
-          </w:tblCellMar>
-        </w:tblPrEx>
         <w:tc>
           <w:tcPr>
             <w:tcW w:w="1800" w:type="dxa"/>
@@ -4880,12 +4646,6 @@
         </w:tc>
       </w:tr>
       <w:tr>
-        <w:tblPrEx>
-          <w:tblCellMar>
-            <w:top w:w="0" w:type="dxa"/>
-            <w:bottom w:w="0" w:type="dxa"/>
-          </w:tblCellMar>
-        </w:tblPrEx>
         <w:tc>
           <w:tcPr>
             <w:tcW w:w="1800" w:type="dxa"/>
@@ -5095,12 +4855,6 @@
         <w:gridCol w:w="1860"/>
       </w:tblGrid>
       <w:tr>
-        <w:tblPrEx>
-          <w:tblCellMar>
-            <w:top w:w="0" w:type="dxa"/>
-            <w:bottom w:w="0" w:type="dxa"/>
-          </w:tblCellMar>
-        </w:tblPrEx>
         <w:tc>
           <w:tcPr>
             <w:tcW w:w="1000" w:type="dxa"/>
@@ -5239,12 +4993,6 @@
         </w:tc>
       </w:tr>
       <w:tr>
-        <w:tblPrEx>
-          <w:tblCellMar>
-            <w:top w:w="0" w:type="dxa"/>
-            <w:bottom w:w="0" w:type="dxa"/>
-          </w:tblCellMar>
-        </w:tblPrEx>
         <w:tc>
           <w:tcPr>
             <w:tcW w:w="1000" w:type="dxa"/>
@@ -5371,12 +5119,6 @@
         </w:tc>
       </w:tr>
       <w:tr>
-        <w:tblPrEx>
-          <w:tblCellMar>
-            <w:top w:w="0" w:type="dxa"/>
-            <w:bottom w:w="0" w:type="dxa"/>
-          </w:tblCellMar>
-        </w:tblPrEx>
         <w:tc>
           <w:tcPr>
             <w:tcW w:w="1000" w:type="dxa"/>
@@ -5544,12 +5286,6 @@
         <w:gridCol w:w="1952"/>
       </w:tblGrid>
       <w:tr>
-        <w:tblPrEx>
-          <w:tblCellMar>
-            <w:top w:w="0" w:type="dxa"/>
-            <w:bottom w:w="0" w:type="dxa"/>
-          </w:tblCellMar>
-        </w:tblPrEx>
         <w:tc>
           <w:tcPr>
             <w:tcW w:w="1000" w:type="dxa"/>
@@ -5688,12 +5424,6 @@
         </w:tc>
       </w:tr>
       <w:tr>
-        <w:tblPrEx>
-          <w:tblCellMar>
-            <w:top w:w="0" w:type="dxa"/>
-            <w:bottom w:w="0" w:type="dxa"/>
-          </w:tblCellMar>
-        </w:tblPrEx>
         <w:tc>
           <w:tcPr>
             <w:tcW w:w="1000" w:type="dxa"/>
@@ -5820,12 +5550,6 @@
         </w:tc>
       </w:tr>
       <w:tr>
-        <w:tblPrEx>
-          <w:tblCellMar>
-            <w:top w:w="0" w:type="dxa"/>
-            <w:bottom w:w="0" w:type="dxa"/>
-          </w:tblCellMar>
-        </w:tblPrEx>
         <w:tc>
           <w:tcPr>
             <w:tcW w:w="1000" w:type="dxa"/>
@@ -5952,12 +5676,6 @@
         </w:tc>
       </w:tr>
       <w:tr>
-        <w:tblPrEx>
-          <w:tblCellMar>
-            <w:top w:w="0" w:type="dxa"/>
-            <w:bottom w:w="0" w:type="dxa"/>
-          </w:tblCellMar>
-        </w:tblPrEx>
         <w:tc>
           <w:tcPr>
             <w:tcW w:w="1000" w:type="dxa"/>
@@ -6100,12 +5818,6 @@
         </w:tc>
       </w:tr>
       <w:tr>
-        <w:tblPrEx>
-          <w:tblCellMar>
-            <w:top w:w="0" w:type="dxa"/>
-            <w:bottom w:w="0" w:type="dxa"/>
-          </w:tblCellMar>
-        </w:tblPrEx>
         <w:tc>
           <w:tcPr>
             <w:tcW w:w="1000" w:type="dxa"/>
@@ -6232,12 +5944,6 @@
         </w:tc>
       </w:tr>
       <w:tr>
-        <w:tblPrEx>
-          <w:tblCellMar>
-            <w:top w:w="0" w:type="dxa"/>
-            <w:bottom w:w="0" w:type="dxa"/>
-          </w:tblCellMar>
-        </w:tblPrEx>
         <w:tc>
           <w:tcPr>
             <w:tcW w:w="1000" w:type="dxa"/>
@@ -6364,12 +6070,6 @@
         </w:tc>
       </w:tr>
       <w:tr>
-        <w:tblPrEx>
-          <w:tblCellMar>
-            <w:top w:w="0" w:type="dxa"/>
-            <w:bottom w:w="0" w:type="dxa"/>
-          </w:tblCellMar>
-        </w:tblPrEx>
         <w:tc>
           <w:tcPr>
             <w:tcW w:w="1000" w:type="dxa"/>
@@ -6512,12 +6212,6 @@
         </w:tc>
       </w:tr>
       <w:tr>
-        <w:tblPrEx>
-          <w:tblCellMar>
-            <w:top w:w="0" w:type="dxa"/>
-            <w:bottom w:w="0" w:type="dxa"/>
-          </w:tblCellMar>
-        </w:tblPrEx>
         <w:tc>
           <w:tcPr>
             <w:tcW w:w="1000" w:type="dxa"/>
@@ -6644,12 +6338,6 @@
         </w:tc>
       </w:tr>
       <w:tr>
-        <w:tblPrEx>
-          <w:tblCellMar>
-            <w:top w:w="0" w:type="dxa"/>
-            <w:bottom w:w="0" w:type="dxa"/>
-          </w:tblCellMar>
-        </w:tblPrEx>
         <w:tc>
           <w:tcPr>
             <w:tcW w:w="1000" w:type="dxa"/>
@@ -6776,12 +6464,6 @@
         </w:tc>
       </w:tr>
       <w:tr>
-        <w:tblPrEx>
-          <w:tblCellMar>
-            <w:top w:w="0" w:type="dxa"/>
-            <w:bottom w:w="0" w:type="dxa"/>
-          </w:tblCellMar>
-        </w:tblPrEx>
         <w:tc>
           <w:tcPr>
             <w:tcW w:w="1000" w:type="dxa"/>
@@ -6908,12 +6590,6 @@
         </w:tc>
       </w:tr>
       <w:tr>
-        <w:tblPrEx>
-          <w:tblCellMar>
-            <w:top w:w="0" w:type="dxa"/>
-            <w:bottom w:w="0" w:type="dxa"/>
-          </w:tblCellMar>
-        </w:tblPrEx>
         <w:tc>
           <w:tcPr>
             <w:tcW w:w="1000" w:type="dxa"/>
@@ -7081,12 +6757,6 @@
         <w:gridCol w:w="1805"/>
       </w:tblGrid>
       <w:tr>
-        <w:tblPrEx>
-          <w:tblCellMar>
-            <w:top w:w="0" w:type="dxa"/>
-            <w:bottom w:w="0" w:type="dxa"/>
-          </w:tblCellMar>
-        </w:tblPrEx>
         <w:tc>
           <w:tcPr>
             <w:tcW w:w="1000" w:type="dxa"/>
@@ -7225,12 +6895,6 @@
         </w:tc>
       </w:tr>
       <w:tr>
-        <w:tblPrEx>
-          <w:tblCellMar>
-            <w:top w:w="0" w:type="dxa"/>
-            <w:bottom w:w="0" w:type="dxa"/>
-          </w:tblCellMar>
-        </w:tblPrEx>
         <w:tc>
           <w:tcPr>
             <w:tcW w:w="1000" w:type="dxa"/>
@@ -7357,12 +7021,6 @@
         </w:tc>
       </w:tr>
       <w:tr>
-        <w:tblPrEx>
-          <w:tblCellMar>
-            <w:top w:w="0" w:type="dxa"/>
-            <w:bottom w:w="0" w:type="dxa"/>
-          </w:tblCellMar>
-        </w:tblPrEx>
         <w:tc>
           <w:tcPr>
             <w:tcW w:w="1000" w:type="dxa"/>
@@ -7505,12 +7163,6 @@
         </w:tc>
       </w:tr>
       <w:tr>
-        <w:tblPrEx>
-          <w:tblCellMar>
-            <w:top w:w="0" w:type="dxa"/>
-            <w:bottom w:w="0" w:type="dxa"/>
-          </w:tblCellMar>
-        </w:tblPrEx>
         <w:tc>
           <w:tcPr>
             <w:tcW w:w="1000" w:type="dxa"/>
@@ -7653,12 +7305,6 @@
         </w:tc>
       </w:tr>
       <w:tr>
-        <w:tblPrEx>
-          <w:tblCellMar>
-            <w:top w:w="0" w:type="dxa"/>
-            <w:bottom w:w="0" w:type="dxa"/>
-          </w:tblCellMar>
-        </w:tblPrEx>
         <w:tc>
           <w:tcPr>
             <w:tcW w:w="1000" w:type="dxa"/>
@@ -7785,12 +7431,6 @@
         </w:tc>
       </w:tr>
       <w:tr>
-        <w:tblPrEx>
-          <w:tblCellMar>
-            <w:top w:w="0" w:type="dxa"/>
-            <w:bottom w:w="0" w:type="dxa"/>
-          </w:tblCellMar>
-        </w:tblPrEx>
         <w:tc>
           <w:tcPr>
             <w:tcW w:w="1000" w:type="dxa"/>
@@ -7958,12 +7598,6 @@
         <w:gridCol w:w="1960"/>
       </w:tblGrid>
       <w:tr>
-        <w:tblPrEx>
-          <w:tblCellMar>
-            <w:top w:w="0" w:type="dxa"/>
-            <w:bottom w:w="0" w:type="dxa"/>
-          </w:tblCellMar>
-        </w:tblPrEx>
         <w:tc>
           <w:tcPr>
             <w:tcW w:w="1000" w:type="dxa"/>
@@ -8102,12 +7736,6 @@
         </w:tc>
       </w:tr>
       <w:tr>
-        <w:tblPrEx>
-          <w:tblCellMar>
-            <w:top w:w="0" w:type="dxa"/>
-            <w:bottom w:w="0" w:type="dxa"/>
-          </w:tblCellMar>
-        </w:tblPrEx>
         <w:tc>
           <w:tcPr>
             <w:tcW w:w="1000" w:type="dxa"/>
@@ -8234,12 +7862,6 @@
         </w:tc>
       </w:tr>
       <w:tr>
-        <w:tblPrEx>
-          <w:tblCellMar>
-            <w:top w:w="0" w:type="dxa"/>
-            <w:bottom w:w="0" w:type="dxa"/>
-          </w:tblCellMar>
-        </w:tblPrEx>
         <w:tc>
           <w:tcPr>
             <w:tcW w:w="1000" w:type="dxa"/>
@@ -8382,12 +8004,6 @@
         </w:tc>
       </w:tr>
       <w:tr>
-        <w:tblPrEx>
-          <w:tblCellMar>
-            <w:top w:w="0" w:type="dxa"/>
-            <w:bottom w:w="0" w:type="dxa"/>
-          </w:tblCellMar>
-        </w:tblPrEx>
         <w:tc>
           <w:tcPr>
             <w:tcW w:w="1000" w:type="dxa"/>
@@ -8571,12 +8187,6 @@
         <w:gridCol w:w="1960"/>
       </w:tblGrid>
       <w:tr>
-        <w:tblPrEx>
-          <w:tblCellMar>
-            <w:top w:w="0" w:type="dxa"/>
-            <w:bottom w:w="0" w:type="dxa"/>
-          </w:tblCellMar>
-        </w:tblPrEx>
         <w:tc>
           <w:tcPr>
             <w:tcW w:w="1000" w:type="dxa"/>
@@ -8715,12 +8325,6 @@
         </w:tc>
       </w:tr>
       <w:tr>
-        <w:tblPrEx>
-          <w:tblCellMar>
-            <w:top w:w="0" w:type="dxa"/>
-            <w:bottom w:w="0" w:type="dxa"/>
-          </w:tblCellMar>
-        </w:tblPrEx>
         <w:tc>
           <w:tcPr>
             <w:tcW w:w="1000" w:type="dxa"/>
@@ -8847,12 +8451,6 @@
         </w:tc>
       </w:tr>
       <w:tr>
-        <w:tblPrEx>
-          <w:tblCellMar>
-            <w:top w:w="0" w:type="dxa"/>
-            <w:bottom w:w="0" w:type="dxa"/>
-          </w:tblCellMar>
-        </w:tblPrEx>
         <w:tc>
           <w:tcPr>
             <w:tcW w:w="1000" w:type="dxa"/>
@@ -9068,12 +8666,6 @@
         <w:gridCol w:w="2353"/>
       </w:tblGrid>
       <w:tr>
-        <w:tblPrEx>
-          <w:tblCellMar>
-            <w:top w:w="0" w:type="dxa"/>
-            <w:bottom w:w="0" w:type="dxa"/>
-          </w:tblCellMar>
-        </w:tblPrEx>
         <w:tc>
           <w:tcPr>
             <w:tcW w:w="1000" w:type="dxa"/>
@@ -9212,12 +8804,6 @@
         </w:tc>
       </w:tr>
       <w:tr>
-        <w:tblPrEx>
-          <w:tblCellMar>
-            <w:top w:w="0" w:type="dxa"/>
-            <w:bottom w:w="0" w:type="dxa"/>
-          </w:tblCellMar>
-        </w:tblPrEx>
         <w:tc>
           <w:tcPr>
             <w:tcW w:w="1000" w:type="dxa"/>
@@ -9344,12 +8930,6 @@
         </w:tc>
       </w:tr>
       <w:tr>
-        <w:tblPrEx>
-          <w:tblCellMar>
-            <w:top w:w="0" w:type="dxa"/>
-            <w:bottom w:w="0" w:type="dxa"/>
-          </w:tblCellMar>
-        </w:tblPrEx>
         <w:tc>
           <w:tcPr>
             <w:tcW w:w="1000" w:type="dxa"/>
@@ -9476,12 +9056,6 @@
         </w:tc>
       </w:tr>
       <w:tr>
-        <w:tblPrEx>
-          <w:tblCellMar>
-            <w:top w:w="0" w:type="dxa"/>
-            <w:bottom w:w="0" w:type="dxa"/>
-          </w:tblCellMar>
-        </w:tblPrEx>
         <w:tc>
           <w:tcPr>
             <w:tcW w:w="1000" w:type="dxa"/>
@@ -9608,12 +9182,6 @@
         </w:tc>
       </w:tr>
       <w:tr>
-        <w:tblPrEx>
-          <w:tblCellMar>
-            <w:top w:w="0" w:type="dxa"/>
-            <w:bottom w:w="0" w:type="dxa"/>
-          </w:tblCellMar>
-        </w:tblPrEx>
         <w:tc>
           <w:tcPr>
             <w:tcW w:w="1000" w:type="dxa"/>
@@ -9799,12 +9367,6 @@
         <w:gridCol w:w="3060"/>
       </w:tblGrid>
       <w:tr>
-        <w:tblPrEx>
-          <w:tblCellMar>
-            <w:top w:w="0" w:type="dxa"/>
-            <w:bottom w:w="0" w:type="dxa"/>
-          </w:tblCellMar>
-        </w:tblPrEx>
         <w:tc>
           <w:tcPr>
             <w:tcW w:w="1800" w:type="dxa"/>
@@ -9943,12 +9505,6 @@
         </w:tc>
       </w:tr>
       <w:tr>
-        <w:tblPrEx>
-          <w:tblCellMar>
-            <w:top w:w="0" w:type="dxa"/>
-            <w:bottom w:w="0" w:type="dxa"/>
-          </w:tblCellMar>
-        </w:tblPrEx>
         <w:tc>
           <w:tcPr>
             <w:tcW w:w="1800" w:type="dxa"/>
@@ -10059,12 +9615,6 @@
         </w:tc>
       </w:tr>
       <w:tr>
-        <w:tblPrEx>
-          <w:tblCellMar>
-            <w:top w:w="0" w:type="dxa"/>
-            <w:bottom w:w="0" w:type="dxa"/>
-          </w:tblCellMar>
-        </w:tblPrEx>
         <w:tc>
           <w:tcPr>
             <w:tcW w:w="1800" w:type="dxa"/>
@@ -10200,12 +9750,6 @@
         </w:tc>
       </w:tr>
       <w:tr>
-        <w:tblPrEx>
-          <w:tblCellMar>
-            <w:top w:w="0" w:type="dxa"/>
-            <w:bottom w:w="0" w:type="dxa"/>
-          </w:tblCellMar>
-        </w:tblPrEx>
         <w:tc>
           <w:tcPr>
             <w:tcW w:w="1800" w:type="dxa"/>
@@ -10382,12 +9926,6 @@
         </w:tc>
       </w:tr>
       <w:tr>
-        <w:tblPrEx>
-          <w:tblCellMar>
-            <w:top w:w="0" w:type="dxa"/>
-            <w:bottom w:w="0" w:type="dxa"/>
-          </w:tblCellMar>
-        </w:tblPrEx>
         <w:tc>
           <w:tcPr>
             <w:tcW w:w="1800" w:type="dxa"/>
@@ -10518,12 +10056,6 @@
         </w:tc>
       </w:tr>
       <w:tr>
-        <w:tblPrEx>
-          <w:tblCellMar>
-            <w:top w:w="0" w:type="dxa"/>
-            <w:bottom w:w="0" w:type="dxa"/>
-          </w:tblCellMar>
-        </w:tblPrEx>
         <w:tc>
           <w:tcPr>
             <w:tcW w:w="1800" w:type="dxa"/>
@@ -10691,12 +10223,6 @@
         </w:tc>
       </w:tr>
       <w:tr>
-        <w:tblPrEx>
-          <w:tblCellMar>
-            <w:top w:w="0" w:type="dxa"/>
-            <w:bottom w:w="0" w:type="dxa"/>
-          </w:tblCellMar>
-        </w:tblPrEx>
         <w:tc>
           <w:tcPr>
             <w:tcW w:w="1800" w:type="dxa"/>
@@ -10832,12 +10358,6 @@
         </w:tc>
       </w:tr>
       <w:tr>
-        <w:tblPrEx>
-          <w:tblCellMar>
-            <w:top w:w="0" w:type="dxa"/>
-            <w:bottom w:w="0" w:type="dxa"/>
-          </w:tblCellMar>
-        </w:tblPrEx>
         <w:tc>
           <w:tcPr>
             <w:tcW w:w="1800" w:type="dxa"/>
@@ -11208,12 +10728,6 @@
         <w:gridCol w:w="3860"/>
       </w:tblGrid>
       <w:tr>
-        <w:tblPrEx>
-          <w:tblCellMar>
-            <w:top w:w="0" w:type="dxa"/>
-            <w:bottom w:w="0" w:type="dxa"/>
-          </w:tblCellMar>
-        </w:tblPrEx>
         <w:tc>
           <w:tcPr>
             <w:tcW w:w="1500" w:type="dxa"/>
@@ -11352,12 +10866,6 @@
         </w:tc>
       </w:tr>
       <w:tr>
-        <w:tblPrEx>
-          <w:tblCellMar>
-            <w:top w:w="0" w:type="dxa"/>
-            <w:bottom w:w="0" w:type="dxa"/>
-          </w:tblCellMar>
-        </w:tblPrEx>
         <w:tc>
           <w:tcPr>
             <w:tcW w:w="1500" w:type="dxa"/>
@@ -11468,12 +10976,6 @@
         </w:tc>
       </w:tr>
       <w:tr>
-        <w:tblPrEx>
-          <w:tblCellMar>
-            <w:top w:w="0" w:type="dxa"/>
-            <w:bottom w:w="0" w:type="dxa"/>
-          </w:tblCellMar>
-        </w:tblPrEx>
         <w:tc>
           <w:tcPr>
             <w:tcW w:w="1500" w:type="dxa"/>
@@ -11584,12 +11086,6 @@
         </w:tc>
       </w:tr>
       <w:tr>
-        <w:tblPrEx>
-          <w:tblCellMar>
-            <w:top w:w="0" w:type="dxa"/>
-            <w:bottom w:w="0" w:type="dxa"/>
-          </w:tblCellMar>
-        </w:tblPrEx>
         <w:tc>
           <w:tcPr>
             <w:tcW w:w="1500" w:type="dxa"/>
@@ -11702,12 +11198,6 @@
         </w:tc>
       </w:tr>
       <w:tr>
-        <w:tblPrEx>
-          <w:tblCellMar>
-            <w:top w:w="0" w:type="dxa"/>
-            <w:bottom w:w="0" w:type="dxa"/>
-          </w:tblCellMar>
-        </w:tblPrEx>
         <w:tc>
           <w:tcPr>
             <w:tcW w:w="1500" w:type="dxa"/>
@@ -11819,12 +11309,6 @@
         </w:tc>
       </w:tr>
       <w:tr>
-        <w:tblPrEx>
-          <w:tblCellMar>
-            <w:top w:w="0" w:type="dxa"/>
-            <w:bottom w:w="0" w:type="dxa"/>
-          </w:tblCellMar>
-        </w:tblPrEx>
         <w:tc>
           <w:tcPr>
             <w:tcW w:w="1500" w:type="dxa"/>
@@ -11935,12 +11419,6 @@
         </w:tc>
       </w:tr>
       <w:tr>
-        <w:tblPrEx>
-          <w:tblCellMar>
-            <w:top w:w="0" w:type="dxa"/>
-            <w:bottom w:w="0" w:type="dxa"/>
-          </w:tblCellMar>
-        </w:tblPrEx>
         <w:tc>
           <w:tcPr>
             <w:tcW w:w="1500" w:type="dxa"/>
@@ -12081,12 +11559,6 @@
         <w:gridCol w:w="1460"/>
       </w:tblGrid>
       <w:tr>
-        <w:tblPrEx>
-          <w:tblCellMar>
-            <w:top w:w="0" w:type="dxa"/>
-            <w:bottom w:w="0" w:type="dxa"/>
-          </w:tblCellMar>
-        </w:tblPrEx>
         <w:tc>
           <w:tcPr>
             <w:tcW w:w="1400" w:type="dxa"/>
@@ -12259,12 +11731,6 @@
         </w:tc>
       </w:tr>
       <w:tr>
-        <w:tblPrEx>
-          <w:tblCellMar>
-            <w:top w:w="0" w:type="dxa"/>
-            <w:bottom w:w="0" w:type="dxa"/>
-          </w:tblCellMar>
-        </w:tblPrEx>
         <w:tc>
           <w:tcPr>
             <w:tcW w:w="1400" w:type="dxa"/>
@@ -12369,14 +11835,7 @@
                 <w:sz w:val="20"/>
                 <w:szCs w:val="20"/>
               </w:rPr>
-              <w:t>₹</w:t>
-            </w:r>
-            <w:r>
-              <w:rPr>
-                <w:sz w:val="20"/>
-                <w:szCs w:val="20"/>
-              </w:rPr>
-              <w:t>8500</w:t>
+              <w:t>₹8500</w:t>
             </w:r>
           </w:p>
         </w:tc>
@@ -12409,12 +11868,6 @@
         </w:tc>
       </w:tr>
       <w:tr>
-        <w:tblPrEx>
-          <w:tblCellMar>
-            <w:top w:w="0" w:type="dxa"/>
-            <w:bottom w:w="0" w:type="dxa"/>
-          </w:tblCellMar>
-        </w:tblPrEx>
         <w:tc>
           <w:tcPr>
             <w:tcW w:w="1400" w:type="dxa"/>
@@ -12519,14 +11972,7 @@
                 <w:sz w:val="20"/>
                 <w:szCs w:val="20"/>
               </w:rPr>
-              <w:t>₹</w:t>
-            </w:r>
-            <w:r>
-              <w:rPr>
-                <w:sz w:val="20"/>
-                <w:szCs w:val="20"/>
-              </w:rPr>
-              <w:t>7200</w:t>
+              <w:t>₹7200</w:t>
             </w:r>
           </w:p>
         </w:tc>
@@ -12559,12 +12005,6 @@
         </w:tc>
       </w:tr>
       <w:tr>
-        <w:tblPrEx>
-          <w:tblCellMar>
-            <w:top w:w="0" w:type="dxa"/>
-            <w:bottom w:w="0" w:type="dxa"/>
-          </w:tblCellMar>
-        </w:tblPrEx>
         <w:tc>
           <w:tcPr>
             <w:tcW w:w="1400" w:type="dxa"/>
@@ -12669,14 +12109,7 @@
                 <w:sz w:val="20"/>
                 <w:szCs w:val="20"/>
               </w:rPr>
-              <w:t>₹</w:t>
-            </w:r>
-            <w:r>
-              <w:rPr>
-                <w:sz w:val="20"/>
-                <w:szCs w:val="20"/>
-              </w:rPr>
-              <w:t>12000</w:t>
+              <w:t>₹12000</w:t>
             </w:r>
           </w:p>
         </w:tc>
@@ -12709,12 +12142,6 @@
         </w:tc>
       </w:tr>
       <w:tr>
-        <w:tblPrEx>
-          <w:tblCellMar>
-            <w:top w:w="0" w:type="dxa"/>
-            <w:bottom w:w="0" w:type="dxa"/>
-          </w:tblCellMar>
-        </w:tblPrEx>
         <w:tc>
           <w:tcPr>
             <w:tcW w:w="1400" w:type="dxa"/>
@@ -12819,14 +12246,7 @@
                 <w:sz w:val="20"/>
                 <w:szCs w:val="20"/>
               </w:rPr>
-              <w:t>₹</w:t>
-            </w:r>
-            <w:r>
-              <w:rPr>
-                <w:sz w:val="20"/>
-                <w:szCs w:val="20"/>
-              </w:rPr>
-              <w:t>6500</w:t>
+              <w:t>₹6500</w:t>
             </w:r>
           </w:p>
         </w:tc>
@@ -12859,12 +12279,6 @@
         </w:tc>
       </w:tr>
       <w:tr>
-        <w:tblPrEx>
-          <w:tblCellMar>
-            <w:top w:w="0" w:type="dxa"/>
-            <w:bottom w:w="0" w:type="dxa"/>
-          </w:tblCellMar>
-        </w:tblPrEx>
         <w:tc>
           <w:tcPr>
             <w:tcW w:w="1400" w:type="dxa"/>
@@ -12978,14 +12392,7 @@
                 <w:sz w:val="20"/>
                 <w:szCs w:val="20"/>
               </w:rPr>
-              <w:t>₹</w:t>
-            </w:r>
-            <w:r>
-              <w:rPr>
-                <w:sz w:val="20"/>
-                <w:szCs w:val="20"/>
-              </w:rPr>
-              <w:t>2500</w:t>
+              <w:t>₹2500</w:t>
             </w:r>
           </w:p>
         </w:tc>
@@ -13018,12 +12425,6 @@
         </w:tc>
       </w:tr>
       <w:tr>
-        <w:tblPrEx>
-          <w:tblCellMar>
-            <w:top w:w="0" w:type="dxa"/>
-            <w:bottom w:w="0" w:type="dxa"/>
-          </w:tblCellMar>
-        </w:tblPrEx>
         <w:tc>
           <w:tcPr>
             <w:tcW w:w="1400" w:type="dxa"/>
@@ -13137,14 +12538,7 @@
                 <w:sz w:val="20"/>
                 <w:szCs w:val="20"/>
               </w:rPr>
-              <w:t>₹</w:t>
-            </w:r>
-            <w:r>
-              <w:rPr>
-                <w:sz w:val="20"/>
-                <w:szCs w:val="20"/>
-              </w:rPr>
-              <w:t>1500</w:t>
+              <w:t>₹1500</w:t>
             </w:r>
           </w:p>
         </w:tc>
@@ -13177,12 +12571,6 @@
         </w:tc>
       </w:tr>
       <w:tr>
-        <w:tblPrEx>
-          <w:tblCellMar>
-            <w:top w:w="0" w:type="dxa"/>
-            <w:bottom w:w="0" w:type="dxa"/>
-          </w:tblCellMar>
-        </w:tblPrEx>
         <w:tc>
           <w:tcPr>
             <w:tcW w:w="1400" w:type="dxa"/>
@@ -13287,14 +12675,7 @@
                 <w:sz w:val="20"/>
                 <w:szCs w:val="20"/>
               </w:rPr>
-              <w:t>₹</w:t>
-            </w:r>
-            <w:r>
-              <w:rPr>
-                <w:sz w:val="20"/>
-                <w:szCs w:val="20"/>
-              </w:rPr>
-              <w:t>1200</w:t>
+              <w:t>₹1200</w:t>
             </w:r>
           </w:p>
         </w:tc>
@@ -13327,12 +12708,6 @@
         </w:tc>
       </w:tr>
       <w:tr>
-        <w:tblPrEx>
-          <w:tblCellMar>
-            <w:top w:w="0" w:type="dxa"/>
-            <w:bottom w:w="0" w:type="dxa"/>
-          </w:tblCellMar>
-        </w:tblPrEx>
         <w:tc>
           <w:tcPr>
             <w:tcW w:w="1400" w:type="dxa"/>
@@ -13437,14 +12812,7 @@
                 <w:sz w:val="20"/>
                 <w:szCs w:val="20"/>
               </w:rPr>
-              <w:t>₹</w:t>
-            </w:r>
-            <w:r>
-              <w:rPr>
-                <w:sz w:val="20"/>
-                <w:szCs w:val="20"/>
-              </w:rPr>
-              <w:t>1800</w:t>
+              <w:t>₹1800</w:t>
             </w:r>
           </w:p>
         </w:tc>
@@ -13477,12 +12845,6 @@
         </w:tc>
       </w:tr>
       <w:tr>
-        <w:tblPrEx>
-          <w:tblCellMar>
-            <w:top w:w="0" w:type="dxa"/>
-            <w:bottom w:w="0" w:type="dxa"/>
-          </w:tblCellMar>
-        </w:tblPrEx>
         <w:tc>
           <w:tcPr>
             <w:tcW w:w="1400" w:type="dxa"/>
@@ -13587,14 +12949,7 @@
                 <w:sz w:val="20"/>
                 <w:szCs w:val="20"/>
               </w:rPr>
-              <w:t>₹</w:t>
-            </w:r>
-            <w:r>
-              <w:rPr>
-                <w:sz w:val="20"/>
-                <w:szCs w:val="20"/>
-              </w:rPr>
-              <w:t>4500</w:t>
+              <w:t>₹4500</w:t>
             </w:r>
           </w:p>
         </w:tc>
@@ -13627,12 +12982,6 @@
         </w:tc>
       </w:tr>
       <w:tr>
-        <w:tblPrEx>
-          <w:tblCellMar>
-            <w:top w:w="0" w:type="dxa"/>
-            <w:bottom w:w="0" w:type="dxa"/>
-          </w:tblCellMar>
-        </w:tblPrEx>
         <w:tc>
           <w:tcPr>
             <w:tcW w:w="1400" w:type="dxa"/>
@@ -13746,14 +13095,7 @@
                 <w:sz w:val="20"/>
                 <w:szCs w:val="20"/>
               </w:rPr>
-              <w:t>₹</w:t>
-            </w:r>
-            <w:r>
-              <w:rPr>
-                <w:sz w:val="20"/>
-                <w:szCs w:val="20"/>
-              </w:rPr>
-              <w:t>2800</w:t>
+              <w:t>₹2800</w:t>
             </w:r>
           </w:p>
         </w:tc>
@@ -13843,10 +13185,7 @@
         <w:spacing w:before="60" w:after="60"/>
       </w:pPr>
       <w:r>
-        <w:t>Entity Framework Core handles query opti</w:t>
-      </w:r>
-      <w:r>
-        <w:t>mization via LINQ with lazy loading disabled</w:t>
+        <w:t>Entity Framework Core handles query optimization via LINQ with lazy loading disabled</w:t>
       </w:r>
     </w:p>
     <w:p>
@@ -14008,12 +13347,6 @@
         <w:gridCol w:w="1860"/>
       </w:tblGrid>
       <w:tr>
-        <w:tblPrEx>
-          <w:tblCellMar>
-            <w:top w:w="0" w:type="dxa"/>
-            <w:bottom w:w="0" w:type="dxa"/>
-          </w:tblCellMar>
-        </w:tblPrEx>
         <w:tc>
           <w:tcPr>
             <w:tcW w:w="3000" w:type="dxa"/>
@@ -14118,12 +13451,6 @@
         </w:tc>
       </w:tr>
       <w:tr>
-        <w:tblPrEx>
-          <w:tblCellMar>
-            <w:top w:w="0" w:type="dxa"/>
-            <w:bottom w:w="0" w:type="dxa"/>
-          </w:tblCellMar>
-        </w:tblPrEx>
         <w:tc>
           <w:tcPr>
             <w:tcW w:w="3000" w:type="dxa"/>
@@ -14201,25 +13528,12 @@
                 <w:sz w:val="20"/>
                 <w:szCs w:val="20"/>
               </w:rPr>
-              <w:t>✅</w:t>
-            </w:r>
-            <w:r>
-              <w:rPr>
-                <w:sz w:val="20"/>
-                <w:szCs w:val="20"/>
-              </w:rPr>
-              <w:t xml:space="preserve"> Pass</w:t>
+              <w:t>✅ Pass</w:t>
             </w:r>
           </w:p>
         </w:tc>
       </w:tr>
       <w:tr>
-        <w:tblPrEx>
-          <w:tblCellMar>
-            <w:top w:w="0" w:type="dxa"/>
-            <w:bottom w:w="0" w:type="dxa"/>
-          </w:tblCellMar>
-        </w:tblPrEx>
         <w:tc>
           <w:tcPr>
             <w:tcW w:w="3000" w:type="dxa"/>
@@ -14315,25 +13629,12 @@
                 <w:sz w:val="20"/>
                 <w:szCs w:val="20"/>
               </w:rPr>
-              <w:t>✅</w:t>
-            </w:r>
-            <w:r>
-              <w:rPr>
-                <w:sz w:val="20"/>
-                <w:szCs w:val="20"/>
-              </w:rPr>
-              <w:t xml:space="preserve"> Pass</w:t>
+              <w:t>✅ Pass</w:t>
             </w:r>
           </w:p>
         </w:tc>
       </w:tr>
       <w:tr>
-        <w:tblPrEx>
-          <w:tblCellMar>
-            <w:top w:w="0" w:type="dxa"/>
-            <w:bottom w:w="0" w:type="dxa"/>
-          </w:tblCellMar>
-        </w:tblPrEx>
         <w:tc>
           <w:tcPr>
             <w:tcW w:w="3000" w:type="dxa"/>
@@ -14429,25 +13730,12 @@
                 <w:sz w:val="20"/>
                 <w:szCs w:val="20"/>
               </w:rPr>
-              <w:t>✅</w:t>
-            </w:r>
-            <w:r>
-              <w:rPr>
-                <w:sz w:val="20"/>
-                <w:szCs w:val="20"/>
-              </w:rPr>
-              <w:t xml:space="preserve"> Pass</w:t>
+              <w:t>✅ Pass</w:t>
             </w:r>
           </w:p>
         </w:tc>
       </w:tr>
       <w:tr>
-        <w:tblPrEx>
-          <w:tblCellMar>
-            <w:top w:w="0" w:type="dxa"/>
-            <w:bottom w:w="0" w:type="dxa"/>
-          </w:tblCellMar>
-        </w:tblPrEx>
         <w:tc>
           <w:tcPr>
             <w:tcW w:w="3000" w:type="dxa"/>
@@ -14534,25 +13822,12 @@
                 <w:sz w:val="20"/>
                 <w:szCs w:val="20"/>
               </w:rPr>
-              <w:t>✅</w:t>
-            </w:r>
-            <w:r>
-              <w:rPr>
-                <w:sz w:val="20"/>
-                <w:szCs w:val="20"/>
-              </w:rPr>
-              <w:t xml:space="preserve"> Pass</w:t>
+              <w:t>✅ Pass</w:t>
             </w:r>
           </w:p>
         </w:tc>
       </w:tr>
       <w:tr>
-        <w:tblPrEx>
-          <w:tblCellMar>
-            <w:top w:w="0" w:type="dxa"/>
-            <w:bottom w:w="0" w:type="dxa"/>
-          </w:tblCellMar>
-        </w:tblPrEx>
         <w:tc>
           <w:tcPr>
             <w:tcW w:w="3000" w:type="dxa"/>
@@ -14639,25 +13914,12 @@
                 <w:sz w:val="20"/>
                 <w:szCs w:val="20"/>
               </w:rPr>
-              <w:t>✅</w:t>
-            </w:r>
-            <w:r>
-              <w:rPr>
-                <w:sz w:val="20"/>
-                <w:szCs w:val="20"/>
-              </w:rPr>
-              <w:t xml:space="preserve"> Pass</w:t>
+              <w:t>✅ Pass</w:t>
             </w:r>
           </w:p>
         </w:tc>
       </w:tr>
       <w:tr>
-        <w:tblPrEx>
-          <w:tblCellMar>
-            <w:top w:w="0" w:type="dxa"/>
-            <w:bottom w:w="0" w:type="dxa"/>
-          </w:tblCellMar>
-        </w:tblPrEx>
         <w:tc>
           <w:tcPr>
             <w:tcW w:w="3000" w:type="dxa"/>
@@ -14760,25 +14022,12 @@
                 <w:sz w:val="20"/>
                 <w:szCs w:val="20"/>
               </w:rPr>
-              <w:t>✅</w:t>
-            </w:r>
-            <w:r>
-              <w:rPr>
-                <w:sz w:val="20"/>
-                <w:szCs w:val="20"/>
-              </w:rPr>
-              <w:t xml:space="preserve"> Pass</w:t>
+              <w:t>✅ Pass</w:t>
             </w:r>
           </w:p>
         </w:tc>
       </w:tr>
       <w:tr>
-        <w:tblPrEx>
-          <w:tblCellMar>
-            <w:top w:w="0" w:type="dxa"/>
-            <w:bottom w:w="0" w:type="dxa"/>
-          </w:tblCellMar>
-        </w:tblPrEx>
         <w:tc>
           <w:tcPr>
             <w:tcW w:w="3000" w:type="dxa"/>
@@ -14874,25 +14123,12 @@
                 <w:sz w:val="20"/>
                 <w:szCs w:val="20"/>
               </w:rPr>
-              <w:t>✅</w:t>
-            </w:r>
-            <w:r>
-              <w:rPr>
-                <w:sz w:val="20"/>
-                <w:szCs w:val="20"/>
-              </w:rPr>
-              <w:t xml:space="preserve"> Pass</w:t>
+              <w:t>✅ Pass</w:t>
             </w:r>
           </w:p>
         </w:tc>
       </w:tr>
       <w:tr>
-        <w:tblPrEx>
-          <w:tblCellMar>
-            <w:top w:w="0" w:type="dxa"/>
-            <w:bottom w:w="0" w:type="dxa"/>
-          </w:tblCellMar>
-        </w:tblPrEx>
         <w:tc>
           <w:tcPr>
             <w:tcW w:w="3000" w:type="dxa"/>
@@ -15006,14 +14242,7 @@
                 <w:sz w:val="20"/>
                 <w:szCs w:val="20"/>
               </w:rPr>
-              <w:t>✅</w:t>
-            </w:r>
-            <w:r>
-              <w:rPr>
-                <w:sz w:val="20"/>
-                <w:szCs w:val="20"/>
-              </w:rPr>
-              <w:t xml:space="preserve"> Pass</w:t>
+              <w:t>✅ Pass</w:t>
             </w:r>
           </w:p>
         </w:tc>
@@ -15084,12 +14313,6 @@
         <w:gridCol w:w="1860"/>
       </w:tblGrid>
       <w:tr>
-        <w:tblPrEx>
-          <w:tblCellMar>
-            <w:top w:w="0" w:type="dxa"/>
-            <w:bottom w:w="0" w:type="dxa"/>
-          </w:tblCellMar>
-        </w:tblPrEx>
         <w:tc>
           <w:tcPr>
             <w:tcW w:w="3000" w:type="dxa"/>
@@ -15194,12 +14417,6 @@
         </w:tc>
       </w:tr>
       <w:tr>
-        <w:tblPrEx>
-          <w:tblCellMar>
-            <w:top w:w="0" w:type="dxa"/>
-            <w:bottom w:w="0" w:type="dxa"/>
-          </w:tblCellMar>
-        </w:tblPrEx>
         <w:tc>
           <w:tcPr>
             <w:tcW w:w="3000" w:type="dxa"/>
@@ -15277,25 +14494,12 @@
                 <w:sz w:val="20"/>
                 <w:szCs w:val="20"/>
               </w:rPr>
-              <w:t>✅</w:t>
-            </w:r>
-            <w:r>
-              <w:rPr>
-                <w:sz w:val="20"/>
-                <w:szCs w:val="20"/>
-              </w:rPr>
-              <w:t xml:space="preserve"> Pass</w:t>
+              <w:t>✅ Pass</w:t>
             </w:r>
           </w:p>
         </w:tc>
       </w:tr>
       <w:tr>
-        <w:tblPrEx>
-          <w:tblCellMar>
-            <w:top w:w="0" w:type="dxa"/>
-            <w:bottom w:w="0" w:type="dxa"/>
-          </w:tblCellMar>
-        </w:tblPrEx>
         <w:tc>
           <w:tcPr>
             <w:tcW w:w="3000" w:type="dxa"/>
@@ -15382,25 +14586,12 @@
                 <w:sz w:val="20"/>
                 <w:szCs w:val="20"/>
               </w:rPr>
-              <w:t>✅</w:t>
-            </w:r>
-            <w:r>
-              <w:rPr>
-                <w:sz w:val="20"/>
-                <w:szCs w:val="20"/>
-              </w:rPr>
-              <w:t xml:space="preserve"> Pass</w:t>
+              <w:t>✅ Pass</w:t>
             </w:r>
           </w:p>
         </w:tc>
       </w:tr>
       <w:tr>
-        <w:tblPrEx>
-          <w:tblCellMar>
-            <w:top w:w="0" w:type="dxa"/>
-            <w:bottom w:w="0" w:type="dxa"/>
-          </w:tblCellMar>
-        </w:tblPrEx>
         <w:tc>
           <w:tcPr>
             <w:tcW w:w="3000" w:type="dxa"/>
@@ -15496,25 +14687,12 @@
                 <w:sz w:val="20"/>
                 <w:szCs w:val="20"/>
               </w:rPr>
-              <w:t>✅</w:t>
-            </w:r>
-            <w:r>
-              <w:rPr>
-                <w:sz w:val="20"/>
-                <w:szCs w:val="20"/>
-              </w:rPr>
-              <w:t xml:space="preserve"> Pass</w:t>
+              <w:t>✅ Pass</w:t>
             </w:r>
           </w:p>
         </w:tc>
       </w:tr>
       <w:tr>
-        <w:tblPrEx>
-          <w:tblCellMar>
-            <w:top w:w="0" w:type="dxa"/>
-            <w:bottom w:w="0" w:type="dxa"/>
-          </w:tblCellMar>
-        </w:tblPrEx>
         <w:tc>
           <w:tcPr>
             <w:tcW w:w="3000" w:type="dxa"/>
@@ -15610,25 +14788,12 @@
                 <w:sz w:val="20"/>
                 <w:szCs w:val="20"/>
               </w:rPr>
-              <w:t>✅</w:t>
-            </w:r>
-            <w:r>
-              <w:rPr>
-                <w:sz w:val="20"/>
-                <w:szCs w:val="20"/>
-              </w:rPr>
-              <w:t xml:space="preserve"> Pass</w:t>
+              <w:t>✅ Pass</w:t>
             </w:r>
           </w:p>
         </w:tc>
       </w:tr>
       <w:tr>
-        <w:tblPrEx>
-          <w:tblCellMar>
-            <w:top w:w="0" w:type="dxa"/>
-            <w:bottom w:w="0" w:type="dxa"/>
-          </w:tblCellMar>
-        </w:tblPrEx>
         <w:tc>
           <w:tcPr>
             <w:tcW w:w="3000" w:type="dxa"/>
@@ -15715,25 +14880,12 @@
                 <w:sz w:val="20"/>
                 <w:szCs w:val="20"/>
               </w:rPr>
-              <w:t>✅</w:t>
-            </w:r>
-            <w:r>
-              <w:rPr>
-                <w:sz w:val="20"/>
-                <w:szCs w:val="20"/>
-              </w:rPr>
-              <w:t xml:space="preserve"> Pass</w:t>
+              <w:t>✅ Pass</w:t>
             </w:r>
           </w:p>
         </w:tc>
       </w:tr>
       <w:tr>
-        <w:tblPrEx>
-          <w:tblCellMar>
-            <w:top w:w="0" w:type="dxa"/>
-            <w:bottom w:w="0" w:type="dxa"/>
-          </w:tblCellMar>
-        </w:tblPrEx>
         <w:tc>
           <w:tcPr>
             <w:tcW w:w="3000" w:type="dxa"/>
@@ -15820,14 +14972,7 @@
                 <w:sz w:val="20"/>
                 <w:szCs w:val="20"/>
               </w:rPr>
-              <w:t>✅</w:t>
-            </w:r>
-            <w:r>
-              <w:rPr>
-                <w:sz w:val="20"/>
-                <w:szCs w:val="20"/>
-              </w:rPr>
-              <w:t xml:space="preserve"> Pass</w:t>
+              <w:t>✅ Pass</w:t>
             </w:r>
           </w:p>
         </w:tc>
@@ -15885,10 +15030,7 @@
       </w:r>
       <w:proofErr w:type="spellStart"/>
       <w:r>
-        <w:t>Swashbu</w:t>
-      </w:r>
-      <w:r>
-        <w:t>ckle</w:t>
+        <w:t>Swashbuckle</w:t>
       </w:r>
       <w:proofErr w:type="spellEnd"/>
       <w:r>
@@ -15927,10 +15069,7 @@
       </w:r>
       <w:proofErr w:type="spellEnd"/>
       <w:r>
-        <w:t xml:space="preserve"> is a fully functional full-stack property rental platform built using Angular 17 and ASP.NET Core Web API. </w:t>
-      </w:r>
-      <w:r>
-        <w:t>The project demonstrates end-to-end implementation of a real-world application covering authentication, CRUD operations, role-based access control, image management, reservations, reviews, and messaging.</w:t>
+        <w:t xml:space="preserve"> is a fully functional full-stack property rental platform built using Angular 17 and ASP.NET Core Web API. The project demonstrates end-to-end implementation of a real-world application covering authentication, CRUD operations, role-based access control, image management, reservations, reviews, and messaging.</w:t>
       </w:r>
     </w:p>
     <w:p>
@@ -16003,10 +15142,7 @@
         <w:spacing w:before="60" w:after="60"/>
       </w:pPr>
       <w:r>
-        <w:t>Entity Framework Core for data</w:t>
-      </w:r>
-      <w:r>
-        <w:t>base-first ORM communication</w:t>
+        <w:t>Entity Framework Core for database-first ORM communication</w:t>
       </w:r>
     </w:p>
     <w:p>
@@ -16084,10 +15220,7 @@
         <w:spacing w:before="80" w:after="80"/>
       </w:pPr>
       <w:r>
-        <w:t>The project was built increm</w:t>
-      </w:r>
-      <w:r>
-        <w:t>entally following a sprint-based approach as defined in the project specification. All core user stories for Renter, Owner, and Admin roles have been implemented and tested.</w:t>
+        <w:t>The project was built incrementally following a sprint-based approach as defined in the project specification. All core user stories for Renter, Owner, and Admin roles have been implemented and tested.</w:t>
       </w:r>
     </w:p>
     <w:p>
@@ -16113,9 +15246,12 @@
       </w:r>
       <w:r>
         <w:rPr>
-          <w:color w:val="C0392B"/>
+          <w:rFonts w:ascii="Times New Roman" w:hAnsi="Times New Roman" w:cs="Times New Roman"/>
+          <w:color w:val="FF0000"/>
+          <w:sz w:val="24"/>
+          <w:szCs w:val="24"/>
         </w:rPr>
-        <w:t>https://github.com/[your-username]/RentAPlace</w:t>
+        <w:t>https://github.com/NaitikNahta/RentAPlace.git</w:t>
       </w:r>
     </w:p>
     <w:p>

</xml_diff>